<commit_message>
Regenerate the manuscript, and make its substituted counts grammatical
The DOCX had fallen behind the evidence it is built from: 45 distinct
implementations against 46, 24 verified offline against 27, 17 through a
paired Abaqus round against 35, 33 unresolved tangent rows against 1.
Every one of those is a number the builder substitutes, so the document
and the evidence had simply diverged.

Regenerating exposed a second defect, in a publication artefact: the
sentence read "The 1 rows the reference cannot settle are reported ... 1
sit below". The prose was correct only for the value it was drafted at,
and the value had moved to one. A number substituted into a sentence now
carries its own agreement -- the count, the noun and the verb travel
together -- and a test reads the built document back to check no
singular-plural mismatch survives a future template change.

Co-Authored-By: Claude Opus 5 <noreply@anthropic.com>
</commit_message>
<xml_diff>
--- a/docs/manuscript/UMAT_OTI_SoftwareX_V5.docx
+++ b/docs/manuscript/UMAT_OTI_SoftwareX_V5.docx
@@ -22,7 +22,7 @@
     </w:p>
     <w:p>
       <w:r>
-        <w:t>UMAT-OTI is an open-source source-to-source transformation tool that generates machine-precision derivatives of Abaqus user-material subroutines (UMATs) using order-truncated imaginary (OTI) arithmetic. Every derivative is specified by four elements — a seed variable, a response variable, an extraction target and a differentiation order — so one compact contract configures the consistent material tangent DDSDDE, the internal Jacobians of local constitutive solves, higher-order stress derivatives, and the exported point-wise parameter sensitivities DSIGMA_DP and DSTATEV_DP from a single unmodified UMAT. The transformed routine preserves the standard UMAT interface. Every product is checked against a reference that shares no code path with it: on an illustrative J2 model the generated tangent agrees with a closed-form consistent tangent over all 108 entries to 2.52</w:t>
+        <w:t>UMAT-OTI is an open-source source-to-source transformation tool that generates machine-precision derivatives of Abaqus user-material subroutines (UMATs) using order-truncated imaginary (OTI) arithmetic. Every derivative is specified by four elements — a seed variable, a response variable, an extraction target and a differentiation order — so one compact contract configures the consistent material tangent DDSDDE, the internal Jacobians of local constitutive solves, higher-order stress derivatives, and the exported point-wise parameter sensitivities DSIGMA_DP and DSTATEV_DP from a single unmodified UMAT. The transformed routine preserves the standard UMAT interface. Every product is checked against a reference that shares no code path with it: on an illustrative J2 model the generated tangent agrees with a closed-form consistent tangent over all 540 entries to 2.19</w:t>
       </w:r>
       <w:r>
         <w:t>×10</w:t>
@@ -34,7 +34,7 @@
         <w:t>-15</w:t>
       </w:r>
       <w:r>
-        <w:t>, and derivatives through order 4 agree with an independent 80-digit reference over 108 comparisons with 0 failures. Across 41 globally deduplicated sources, 36 are numerically verified by at least one route and 5 are not, each with a recorded reason. Extracting a model's internal Jacobian also audits the one it ships: in 2 of 6 sources the hand-coded Jacobian differs from the independent reference by up to 2.59%, while the extracted one agrees to 5.21</w:t>
+        <w:t>, and derivatives through order 4 agree with an independent 80-digit reference over 540 comparisons with 0 failures. Across 41 globally deduplicated sources, 39 are numerically verified by at least one route and 2 are not, each with a recorded reason. Extracting a model's internal Jacobian also audits the one it ships: in 2 of 6 sources the hand-coded Jacobian differs from the independent reference by up to 2.59%, while the extracted one agrees to 5.21</w:t>
       </w:r>
       <w:r>
         <w:t>×10</w:t>
@@ -219,7 +219,7 @@
     </w:p>
     <w:p>
       <w:r>
-        <w:t>The consistent tangent is checked against two references that fail differently: the closed-form elastoplastic consistent tangent, and an 80-digit centred difference of an independent integrator. Over 108 entries none disagrees. 66 are zeros of the matrix, returned as exactly zero; the remaining 42 agree to 2.52</w:t>
+        <w:t>The consistent tangent is checked against two references that fail differently: the closed-form elastoplastic consistent tangent, and an 80-digit centred difference of an independent integrator. Over 540 entries none disagrees. 354 are zeros of the matrix, returned as exactly zero; the remaining 186 agree to 2.19</w:t>
       </w:r>
       <w:r>
         <w:t>×10</w:t>
@@ -231,7 +231,7 @@
         <w:t>-15</w:t>
       </w:r>
       <w:r>
-        <w:t>, while the two references agree with each other to 4.77</w:t>
+        <w:t>, while the two references agree with each other to 4.62</w:t>
       </w:r>
       <w:r>
         <w:t>×10</w:t>
@@ -243,7 +243,7 @@
         <w:t>-14</w:t>
       </w:r>
       <w:r>
-        <w:t>. Raising the requested order on the same path retains the higher derivatives of the same stress update: 108 comparisons through order 4, 0 failures, worst relative difference 1.94</w:t>
+        <w:t>. Raising the requested order on the same path retains the higher derivatives of the same stress update: 540 comparisons through order 4, 0 failures, worst relative difference 1.89</w:t>
       </w:r>
       <w:r>
         <w:t>×10</w:t>
@@ -282,7 +282,7 @@
       <w:r>
         <w:drawing>
           <wp:inline xmlns:a="http://schemas.openxmlformats.org/drawingml/2006/main" xmlns:pic="http://schemas.openxmlformats.org/drawingml/2006/picture">
-            <wp:extent cx="5669280" cy="3200400"/>
+            <wp:extent cx="5669280" cy="5852160"/>
             <wp:docPr id="3" name="Picture 3"/>
             <wp:cNvGraphicFramePr>
               <a:graphicFrameLocks noChangeAspect="1"/>
@@ -303,7 +303,7 @@
                   <pic:spPr>
                     <a:xfrm>
                       <a:off x="0" y="0"/>
-                      <a:ext cx="5669280" cy="3200400"/>
+                      <a:ext cx="5669280" cy="5852160"/>
                     </a:xfrm>
                     <a:prstGeom prst="rect"/>
                   </pic:spPr>
@@ -330,7 +330,7 @@
       <w:r>
         <w:drawing>
           <wp:inline xmlns:a="http://schemas.openxmlformats.org/drawingml/2006/main" xmlns:pic="http://schemas.openxmlformats.org/drawingml/2006/picture">
-            <wp:extent cx="5669280" cy="3108960"/>
+            <wp:extent cx="5669280" cy="5852160"/>
             <wp:docPr id="4" name="Picture 4"/>
             <wp:cNvGraphicFramePr>
               <a:graphicFrameLocks noChangeAspect="1"/>
@@ -351,7 +351,7 @@
                   <pic:spPr>
                     <a:xfrm>
                       <a:off x="0" y="0"/>
-                      <a:ext cx="5669280" cy="3108960"/>
+                      <a:ext cx="5669280" cy="5852160"/>
                     </a:xfrm>
                     <a:prstGeom prst="rect"/>
                   </pic:spPr>
@@ -378,7 +378,7 @@
       <w:r>
         <w:drawing>
           <wp:inline xmlns:a="http://schemas.openxmlformats.org/drawingml/2006/main" xmlns:pic="http://schemas.openxmlformats.org/drawingml/2006/picture">
-            <wp:extent cx="5669280" cy="5120640"/>
+            <wp:extent cx="5669280" cy="5486400"/>
             <wp:docPr id="5" name="Picture 5"/>
             <wp:cNvGraphicFramePr>
               <a:graphicFrameLocks noChangeAspect="1"/>
@@ -399,7 +399,7 @@
                   <pic:spPr>
                     <a:xfrm>
                       <a:off x="0" y="0"/>
-                      <a:ext cx="5669280" cy="5120640"/>
+                      <a:ext cx="5669280" cy="5486400"/>
                     </a:xfrm>
                     <a:prstGeom prst="rect"/>
                   </pic:spPr>
@@ -430,17 +430,17 @@
     </w:p>
     <w:p>
       <w:r>
-        <w:t>Sources are counted after global identity reconciliation. A UMAT reachable both from the in-repository archive and from a pinned upstream snapshot is one implementation with two origins, not two sources: 54 discovered files reduce to 45 distinct implementations across 3 independent upstream repositories, spanning 27 constitutive models. The illustrative example is excluded from every count in this section.</w:t>
+        <w:t>Sources are counted after global identity reconciliation. A UMAT reachable both from the in-repository archive and from a pinned upstream snapshot is one implementation with two origins, not two sources: 54 discovered files reduce to 46 distinct implementations across 3 independent upstream repositories, spanning 27 constitutive models. The illustrative example is excluded from every count in this section.</w:t>
       </w:r>
     </w:p>
     <w:p>
       <w:r>
-        <w:t>Of 41 collection sources, 24 are verified offline — transformed, compiled twice, checked for primal parity and compared against an independently replayed reference — and 17 passed a paired Abaqus round in which the original and transformed subroutines ran as separate jobs on the same deck. 36 are verified by at least one route. The remaining 5 are kept in the denominator with a recorded reason: an ambiguous helper closure, an absent upstream property vector, a failed execution in the archived Abaqus round, and two whose reference cannot adjudicate every row. Figure 6 shows the coverage and Table 2 the paired Abaqus round case by case.</w:t>
+        <w:t>Of 41 collection sources, 27 are verified offline — transformed, compiled twice, checked for primal parity and compared against an independently replayed reference — and 35 passed a paired Abaqus round in which the original and transformed subroutines ran as separate jobs on the same deck. 39 are verified by at least one route. The remaining 2 are kept in the denominator with a recorded reason: an ambiguous helper closure, an absent upstream property vector, a failed execution in the archived Abaqus round, and two whose reference cannot adjudicate every row. Figure 6 shows the coverage and Table 2 the paired Abaqus round case by case.</w:t>
       </w:r>
     </w:p>
     <w:p>
       <w:r>
-        <w:t>Across 19 models the sweep produced 13980 comparisons, 13947 agreeing and 0 disagreeing, with a worst relative difference of 8.19</w:t>
+        <w:t>Across 19 models the sweep produced 13980 comparisons, 13979 agreeing and 0 disagreeing, with a worst relative difference of 8.19</w:t>
       </w:r>
       <w:r>
         <w:t>×10</w:t>
@@ -452,7 +452,7 @@
         <w:t>-7</w:t>
       </w:r>
       <w:r>
-        <w:t>. The 33 rows the reference cannot settle are reported by reason rather than pooled: 5 sit below what a centred difference resolves at any step, and 28 sit on the increment where a Drucker-Prager model first yields, where the stencil straddles the kink and returns a secant across it rather than the derivative on the branch the increment took. Those rows withhold their directions rather than being counted either way. Table 6 lists every collection model with the rows it contributed and the reason where a direction is withheld, and Table 7 the external sources with the stage each one reached.</w:t>
+        <w:t>. The 1 row the reference cannot settle is reported by reason rather than pooled: 1 sits below what a centred difference resolves at any step, and 0 sit on the increment where a Drucker-Prager model first yields, where the stencil straddles the kink and returns a secant across it rather than the derivative on the branch the increment took. Those rows withhold their directions rather than being counted either way. Table 6 lists every collection model with the rows it contributed and the reason where a direction is withheld, and Table 7 the external sources with the stage each one reached.</w:t>
       </w:r>
     </w:p>
     <w:p>
@@ -798,7 +798,7 @@
           <w:i/>
           <w:sz w:val="18"/>
         </w:rPr>
-        <w:t>Every numerical value in this manuscript was substituted from the executed evidence at commit c24ff0d3c43cfc1f5aa4522c0fe17b03b8bf5bca by tools/manuscript/build_v5_manuscript.py. Tables are generated separately into paper_results/tables/paper_tables.docx. Main text: 1809 words of a 3000-word limit.</w:t>
+        <w:t>Every numerical value in this manuscript was substituted from the executed evidence at commit 1f9f91c474e3d8131c8d5d6e6362f11a74734588 by tools/manuscript/build_v5_manuscript.py. Tables are generated separately into paper_results/tables/paper_tables.docx. Main text: 1809 words of a 3000-word limit.</w:t>
       </w:r>
     </w:p>
     <w:sectPr>

</xml_diff>